<commit_message>
Modificacion de app_chatbot para incluir GPT-5.1
</commit_message>
<xml_diff>
--- a/datos/pliego_final.docx
+++ b/datos/pliego_final.docx
@@ -16,7 +16,7 @@
         <w:pStyle w:val="Heading1"/>
       </w:pPr>
       <w:r>
-        <w:t>CONDICIONES ECONOMICAS</w:t>
+        <w:t>1. OBJETO DEL CONTRATO</w:t>
       </w:r>
     </w:p>
     <w:p>
@@ -24,7 +24,7 @@
         <w:pStyle w:val="Heading2"/>
       </w:pPr>
       <w:r>
-        <w:t>PLAZOS</w:t>
+        <w:t>1.1 ALCANCE DE LOS TRABAJOS</w:t>
       </w:r>
     </w:p>
     <w:p>
@@ -32,52 +32,27 @@
         <w:jc w:val="both"/>
       </w:pPr>
       <w:r>
-        <w:t>**CONDICIONES ECONÓMICAS**</w:t>
+        <w:t>**1. OBJETO DEL CONTRATO**</w:t>
         <w:br/>
         <w:br/>
-        <w:t>**PLAZOS**</w:t>
+        <w:t>**1.1 Alcance de los trabajos**</w:t>
         <w:br/>
         <w:br/>
-        <w:t>El plazo total de ejecución del contrato será de nueve (9) meses a contar desde la fecha de formalización del mismo.</w:t>
+        <w:t>El objeto del presente contrato es el mantenimiento de jardines, que incluye la realización de las siguientes tareas:</w:t>
         <w:br/>
         <w:br/>
-        <w:t>Durante este período, el contratista deberá cumplir con las obligaciones establecidas en el contrato y realizar los trabajos necesarios para su ejecución.</w:t>
+        <w:t>* Podas y recortes de vegetales en los jardines públicos y privados afectados.</w:t>
+        <w:br/>
+        <w:t>* Tratamiento de malezas y hierbas invasoras en los jardines mencionados.</w:t>
+        <w:br/>
+        <w:t>* Riego y drenaje adecuado para mantener la salud y belleza de las plantas.</w:t>
+        <w:br/>
+        <w:t>* Control de plagas y enfermedades que puedan afectar a las plantas.</w:t>
+        <w:br/>
+        <w:t>* Mantenimiento de los sistemas de riego y drenaje existentes.</w:t>
         <w:br/>
         <w:br/>
-        <w:t>Es importante destacar que, si se establece un plazo de garantía, éste será indicado en la cláusula correspondiente del presente pliego.</w:t>
-      </w:r>
-    </w:p>
-    <w:p>
-      <w:pPr>
-        <w:pStyle w:val="Heading1"/>
-      </w:pPr>
-      <w:r>
-        <w:t>CONDICIONES ECONÓMICAS</w:t>
-      </w:r>
-    </w:p>
-    <w:p>
-      <w:pPr>
-        <w:pStyle w:val="Heading2"/>
-      </w:pPr>
-      <w:r>
-        <w:t>PLAZOS</w:t>
-      </w:r>
-    </w:p>
-    <w:p>
-      <w:pPr>
-        <w:jc w:val="both"/>
-      </w:pPr>
-      <w:r>
-        <w:t>**CONDICIONES ECONÓMICAS**</w:t>
-        <w:br/>
-        <w:br/>
-        <w:t>**PLAZOS**</w:t>
-        <w:br/>
-        <w:br/>
-        <w:t>El plazo para solicitar información adicional sobre los pliegos y demás documentación complementaria será de 12 días, contados a partir del día siguiente al de la publicación en el Boletín Oficial de La Rioja.</w:t>
-        <w:br/>
-        <w:br/>
-        <w:t>Las aclaraciones que se proporcionen tendrán carácter vinculante.</w:t>
+        <w:t>El contratista deberá realizar estos trabajos con la debida profesionalidad y eficiencia, asegurando que se cumplan los requisitos establecidos en el pliego de prescripciones técnicas y en este contrato.</w:t>
       </w:r>
     </w:p>
     <w:sectPr>

</xml_diff>